<commit_message>
Retitle the capstone report to reflect extending EPDS-10 screening rather than a new tool
Responds to the defense panel's novelty/positioning feedback: the
title now leads with what the project actually extends (a validated
screening instrument, longitudinal tracking) instead of leading with
"bilingual companion," which reads as language support alone.
</commit_message>
<xml_diff>
--- a/UMUBYEYI_Final report_turnitin_submission (2).docx
+++ b/UMUBYEYI_Final report_turnitin_submission (2).docx
@@ -205,7 +205,7 @@
           <w:szCs w:val="36"/>
           <w:rtl w:val="0"/>
         </w:rPr>
-        <w:t xml:space="preserve">A bilingual first-time mum companion: </w:t>
+        <w:t>Umubyeyi:</w:t>
       </w:r>
     </w:p>
     <w:p>
@@ -231,7 +231,7 @@
           <w:u w:val="single"/>
           <w:rtl w:val="0"/>
         </w:rPr>
-        <w:t xml:space="preserve">Umubyeyi</w:t>
+        <w:t>Extending EPDS-10 Screening with Bilingual, Longitudinal Postpartum Support</w:t>
       </w:r>
       <w:r>
         <w:rPr>

</xml_diff>